<commit_message>
HW1 plain report: open with the PPT's own problem statement
Rewrite the opening to follow the assignment PPT wording and drop
the first-person "my settings" phrasing around table 1.

Co-Authored-By: Claude Opus 5.5 <noreply@anthropic.com>
</commit_message>
<xml_diff>
--- a/hw1/HW1_report_plain.docx
+++ b/hw1/HW1_report_plain.docx
@@ -53,7 +53,7 @@
           <w:sz w:val="22"/>
           <w:szCs w:val="22"/>
         </w:rPr>
-        <w:t xml:space="preserve">這次用 ns-3.49 模擬一個 802.11n 的無線網路。</w:t>
+        <w:t xml:space="preserve">這次作業要在 IEEE 802.11n Wi-Fi 網路中，觀察不同負載與競爭程度下的 Throughput。</w:t>
       </w:r>
     </w:p>
     <w:p>
@@ -66,7 +66,20 @@
           <w:sz w:val="22"/>
           <w:szCs w:val="22"/>
         </w:rPr>
-        <w:t xml:space="preserve">想看三件事會怎麼影響 Throughput：</w:t>
+        <w:t xml:space="preserve">主要調整三個參數：STA 數（5、20）、每個 STA 的 Arrival Rate λ（200、800 packets/s），以及 RTS/CTS（開、關）。</w:t>
+      </w:r>
+    </w:p>
+    <w:p>
+      <w:pPr>
+        <w:spacing w:after="20" w:line="300"/>
+      </w:pPr>
+      <w:r>
+        <w:rPr>
+          <w:rFonts w:ascii="Times New Roman" w:eastAsia="PMingLiU" w:hAnsi="Times New Roman"/>
+          <w:sz w:val="22"/>
+          <w:szCs w:val="22"/>
+        </w:rPr>
+        <w:t xml:space="preserve">最後畫出 Throughput vs. Arrival Rate，依 STA 數分組比較，並說明觀察到的變化與現象。</w:t>
       </w:r>
     </w:p>
     <w:p>
@@ -79,7 +92,7 @@
           <w:sz w:val="22"/>
           <w:szCs w:val="22"/>
         </w:rPr>
-        <w:t xml:space="preserve">STA（連到 AP 的無線裝置）有幾台、每台每秒產生多少封包（Arrival Rate，λ），還有 RTS/CTS 開或關。</w:t>
+        <w:t xml:space="preserve">模擬工具是 ns-3.49。</w:t>
       </w:r>
     </w:p>
     <w:p>
@@ -92,7 +105,7 @@
           <w:sz w:val="22"/>
           <w:szCs w:val="22"/>
         </w:rPr>
-        <w:t xml:space="preserve">題目給的 8 個系統參數，我的設定如表 1。</w:t>
+        <w:t xml:space="preserve">題目的 8 個系統參數，設定如表 1。</w:t>
       </w:r>
     </w:p>
     <w:p>
@@ -236,7 +249,7 @@
                 <w:sz w:val="20"/>
                 <w:szCs w:val="20"/>
               </w:rPr>
-              <w:t xml:space="preserve">我的設定</w:t>
+              <w:t xml:space="preserve">設定</w:t>
             </w:r>
           </w:p>
         </w:tc>

</xml_diff>